<commit_message>
update template - remove specs and photo
</commit_message>
<xml_diff>
--- a/template/kp_template.docx
+++ b/template/kp_template.docx
@@ -272,7 +272,25 @@
           <w:b/>
           <w:bCs/>
         </w:rPr>
-        <w:t xml:space="preserve">ООО «Фарсал» </w:t>
+        <w:t>ООО «</w:t>
+      </w:r>
+      <w:proofErr w:type="spellStart"/>
+      <w:r>
+        <w:rPr>
+          <w:rFonts w:ascii="Arial" w:hAnsi="Arial" w:cs="Arial"/>
+          <w:b/>
+          <w:bCs/>
+        </w:rPr>
+        <w:t>Фарсал</w:t>
+      </w:r>
+      <w:proofErr w:type="spellEnd"/>
+      <w:r>
+        <w:rPr>
+          <w:rFonts w:ascii="Arial" w:hAnsi="Arial" w:cs="Arial"/>
+          <w:b/>
+          <w:bCs/>
+        </w:rPr>
+        <w:t xml:space="preserve">» </w:t>
       </w:r>
       <w:r>
         <w:rPr>
@@ -381,55 +399,6 @@
                 <w:szCs w:val="20"/>
               </w:rPr>
             </w:pPr>
-            <w:r>
-              <w:rPr>
-                <w:rFonts w:ascii="Arial" w:hAnsi="Arial" w:cs="Arial"/>
-                <w:noProof/>
-                <w:sz w:val="24"/>
-                <w:szCs w:val="20"/>
-              </w:rPr>
-              <w:drawing>
-                <wp:inline distT="0" distB="0" distL="0" distR="0" wp14:anchorId="2A17FE3A" wp14:editId="31139FA4">
-                  <wp:extent cx="5759450" cy="4319905"/>
-                  <wp:effectExtent l="0" t="0" r="0" b="4445"/>
-                  <wp:docPr id="1353845617" name="Рисунок 1"/>
-                  <wp:cNvGraphicFramePr>
-                    <a:graphicFrameLocks xmlns:a="http://schemas.openxmlformats.org/drawingml/2006/main" noChangeAspect="1"/>
-                  </wp:cNvGraphicFramePr>
-                  <a:graphic xmlns:a="http://schemas.openxmlformats.org/drawingml/2006/main">
-                    <a:graphicData uri="http://schemas.openxmlformats.org/drawingml/2006/picture">
-                      <pic:pic xmlns:pic="http://schemas.openxmlformats.org/drawingml/2006/picture">
-                        <pic:nvPicPr>
-                          <pic:cNvPr id="1353845617" name="Рисунок 1353845617"/>
-                          <pic:cNvPicPr/>
-                        </pic:nvPicPr>
-                        <pic:blipFill>
-                          <a:blip r:embed="rId7" cstate="print">
-                            <a:extLst>
-                              <a:ext uri="{28A0092B-C50C-407E-A947-70E740481C1C}">
-                                <a14:useLocalDpi xmlns:a14="http://schemas.microsoft.com/office/drawing/2010/main" val="0"/>
-                              </a:ext>
-                            </a:extLst>
-                          </a:blip>
-                          <a:stretch>
-                            <a:fillRect/>
-                          </a:stretch>
-                        </pic:blipFill>
-                        <pic:spPr>
-                          <a:xfrm>
-                            <a:off x="0" y="0"/>
-                            <a:ext cx="5759450" cy="4319905"/>
-                          </a:xfrm>
-                          <a:prstGeom prst="rect">
-                            <a:avLst/>
-                          </a:prstGeom>
-                        </pic:spPr>
-                      </pic:pic>
-                    </a:graphicData>
-                  </a:graphic>
-                </wp:inline>
-              </w:drawing>
-            </w:r>
           </w:p>
         </w:tc>
       </w:tr>
@@ -476,1376 +445,6 @@
         <w:t>Технические характеристики</w:t>
       </w:r>
     </w:p>
-    <w:tbl>
-      <w:tblPr>
-        <w:tblStyle w:val="ac"/>
-        <w:tblW w:w="0" w:type="auto"/>
-        <w:tblCellMar>
-          <w:top w:w="85" w:type="dxa"/>
-          <w:bottom w:w="85" w:type="dxa"/>
-        </w:tblCellMar>
-        <w:tblLook w:val="04A0" w:firstRow="1" w:lastRow="0" w:firstColumn="1" w:lastColumn="0" w:noHBand="0" w:noVBand="1"/>
-      </w:tblPr>
-      <w:tblGrid>
-        <w:gridCol w:w="4248"/>
-        <w:gridCol w:w="4812"/>
-      </w:tblGrid>
-      <w:tr>
-        <w:tc>
-          <w:tcPr>
-            <w:tcW w:w="4248" w:type="dxa"/>
-            <w:shd w:val="clear" w:color="auto" w:fill="FAD6A6"/>
-            <w:vAlign w:val="center"/>
-          </w:tcPr>
-          <w:p>
-            <w:pPr>
-              <w:jc w:val="center"/>
-              <w:rPr>
-                <w:rFonts w:ascii="Arial" w:hAnsi="Arial" w:cs="Arial"/>
-                <w:b/>
-                <w:bCs/>
-                <w:sz w:val="22"/>
-                <w:szCs w:val="18"/>
-              </w:rPr>
-            </w:pPr>
-            <w:r>
-              <w:rPr>
-                <w:rFonts w:ascii="Arial" w:hAnsi="Arial" w:cs="Arial"/>
-                <w:b/>
-                <w:bCs/>
-                <w:sz w:val="22"/>
-                <w:szCs w:val="18"/>
-              </w:rPr>
-              <w:t>Характеристика</w:t>
-            </w:r>
-          </w:p>
-        </w:tc>
-        <w:tc>
-          <w:tcPr>
-            <w:tcW w:w="4812" w:type="dxa"/>
-            <w:shd w:val="clear" w:color="auto" w:fill="FAD6A6"/>
-            <w:vAlign w:val="center"/>
-          </w:tcPr>
-          <w:p>
-            <w:pPr>
-              <w:jc w:val="center"/>
-              <w:rPr>
-                <w:rFonts w:ascii="Arial" w:hAnsi="Arial" w:cs="Arial"/>
-                <w:b/>
-                <w:bCs/>
-                <w:sz w:val="22"/>
-                <w:szCs w:val="18"/>
-              </w:rPr>
-            </w:pPr>
-            <w:r>
-              <w:rPr>
-                <w:rFonts w:ascii="Arial" w:hAnsi="Arial" w:cs="Arial"/>
-                <w:b/>
-                <w:bCs/>
-                <w:sz w:val="22"/>
-                <w:szCs w:val="18"/>
-              </w:rPr>
-              <w:t>Значение</w:t>
-            </w:r>
-          </w:p>
-        </w:tc>
-      </w:tr>
-      <w:tr>
-        <w:tc>
-          <w:tcPr>
-            <w:tcW w:w="4248" w:type="dxa"/>
-            <w:vAlign w:val="center"/>
-          </w:tcPr>
-          <w:p>
-            <w:pPr>
-              <w:rPr>
-                <w:rFonts w:ascii="Arial" w:hAnsi="Arial" w:cs="Arial"/>
-                <w:sz w:val="22"/>
-                <w:szCs w:val="18"/>
-              </w:rPr>
-            </w:pPr>
-            <w:r>
-              <w:rPr>
-                <w:rFonts w:ascii="Arial" w:hAnsi="Arial" w:cs="Arial"/>
-                <w:sz w:val="22"/>
-                <w:szCs w:val="18"/>
-              </w:rPr>
-              <w:t>Материал насоса</w:t>
-            </w:r>
-          </w:p>
-        </w:tc>
-        <w:tc>
-          <w:tcPr>
-            <w:tcW w:w="4812" w:type="dxa"/>
-            <w:vAlign w:val="center"/>
-          </w:tcPr>
-          <w:p>
-            <w:pPr>
-              <w:jc w:val="center"/>
-              <w:rPr>
-                <w:rFonts w:ascii="Arial" w:hAnsi="Arial" w:cs="Arial"/>
-                <w:b/>
-                <w:bCs/>
-                <w:sz w:val="22"/>
-                <w:szCs w:val="18"/>
-              </w:rPr>
-            </w:pPr>
-            <w:r>
-              <w:rPr>
-                <w:rFonts w:ascii="Arial" w:hAnsi="Arial" w:cs="Arial"/>
-                <w:b/>
-                <w:bCs/>
-                <w:sz w:val="22"/>
-                <w:szCs w:val="18"/>
-              </w:rPr>
-              <w:t xml:space="preserve">чугун </w:t>
-            </w:r>
-            <w:r>
-              <w:rPr>
-                <w:rFonts w:ascii="Arial" w:hAnsi="Arial" w:cs="Arial"/>
-                <w:b/>
-                <w:bCs/>
-                <w:sz w:val="22"/>
-                <w:szCs w:val="18"/>
-              </w:rPr>
-              <w:t>ASTM A48</w:t>
-            </w:r>
-          </w:p>
-        </w:tc>
-      </w:tr>
-      <w:tr>
-        <w:tc>
-          <w:tcPr>
-            <w:tcW w:w="4248" w:type="dxa"/>
-            <w:shd w:val="clear" w:color="auto" w:fill="F2F2F2" w:themeFill="background1" w:themeFillShade="F2"/>
-            <w:vAlign w:val="center"/>
-          </w:tcPr>
-          <w:p>
-            <w:pPr>
-              <w:rPr>
-                <w:rFonts w:ascii="Arial" w:hAnsi="Arial" w:cs="Arial"/>
-                <w:sz w:val="22"/>
-                <w:szCs w:val="18"/>
-              </w:rPr>
-            </w:pPr>
-            <w:r>
-              <w:rPr>
-                <w:rFonts w:ascii="Arial" w:hAnsi="Arial" w:cs="Arial"/>
-                <w:sz w:val="22"/>
-                <w:szCs w:val="18"/>
-              </w:rPr>
-              <w:t>Электродвигатель</w:t>
-            </w:r>
-          </w:p>
-        </w:tc>
-        <w:tc>
-          <w:tcPr>
-            <w:tcW w:w="4812" w:type="dxa"/>
-            <w:shd w:val="clear" w:color="auto" w:fill="F2F2F2" w:themeFill="background1" w:themeFillShade="F2"/>
-            <w:vAlign w:val="center"/>
-          </w:tcPr>
-          <w:p>
-            <w:pPr>
-              <w:jc w:val="center"/>
-              <w:rPr>
-                <w:rFonts w:ascii="Arial" w:hAnsi="Arial" w:cs="Arial"/>
-                <w:b/>
-                <w:bCs/>
-                <w:sz w:val="22"/>
-                <w:szCs w:val="18"/>
-              </w:rPr>
-            </w:pPr>
-            <w:r>
-              <w:rPr>
-                <w:rFonts w:ascii="Arial" w:hAnsi="Arial" w:cs="Arial"/>
-                <w:b/>
-                <w:bCs/>
-                <w:sz w:val="22"/>
-                <w:szCs w:val="18"/>
-              </w:rPr>
-              <w:t>YE3 315L2-4</w:t>
-            </w:r>
-          </w:p>
-        </w:tc>
-      </w:tr>
-      <w:tr>
-        <w:tc>
-          <w:tcPr>
-            <w:tcW w:w="4248" w:type="dxa"/>
-            <w:vAlign w:val="center"/>
-          </w:tcPr>
-          <w:p>
-            <w:pPr>
-              <w:rPr>
-                <w:rFonts w:ascii="Arial" w:hAnsi="Arial" w:cs="Arial"/>
-                <w:sz w:val="22"/>
-                <w:szCs w:val="18"/>
-              </w:rPr>
-            </w:pPr>
-            <w:r>
-              <w:rPr>
-                <w:rFonts w:ascii="Arial" w:hAnsi="Arial" w:cs="Arial"/>
-                <w:sz w:val="22"/>
-                <w:szCs w:val="18"/>
-              </w:rPr>
-              <w:t>Тип установки электродвигателя</w:t>
-            </w:r>
-          </w:p>
-        </w:tc>
-        <w:tc>
-          <w:tcPr>
-            <w:tcW w:w="4812" w:type="dxa"/>
-            <w:vAlign w:val="center"/>
-          </w:tcPr>
-          <w:p>
-            <w:pPr>
-              <w:jc w:val="center"/>
-              <w:rPr>
-                <w:rFonts w:ascii="Arial" w:hAnsi="Arial" w:cs="Arial"/>
-                <w:b/>
-                <w:bCs/>
-                <w:sz w:val="22"/>
-                <w:szCs w:val="18"/>
-              </w:rPr>
-            </w:pPr>
-            <w:r>
-              <w:rPr>
-                <w:rFonts w:ascii="Arial" w:hAnsi="Arial" w:cs="Arial"/>
-                <w:b/>
-                <w:bCs/>
-                <w:sz w:val="22"/>
-                <w:szCs w:val="18"/>
-              </w:rPr>
-              <w:t xml:space="preserve">горизонтальная установка, </w:t>
-            </w:r>
-            <w:r>
-              <w:rPr>
-                <w:rFonts w:ascii="Arial" w:hAnsi="Arial" w:cs="Arial"/>
-                <w:b/>
-                <w:bCs/>
-                <w:sz w:val="22"/>
-                <w:szCs w:val="18"/>
-              </w:rPr>
-              <w:br/>
-            </w:r>
-            <w:r>
-              <w:rPr>
-                <w:rFonts w:ascii="Arial" w:hAnsi="Arial" w:cs="Arial"/>
-                <w:b/>
-                <w:bCs/>
-                <w:sz w:val="22"/>
-                <w:szCs w:val="18"/>
-              </w:rPr>
-              <w:t>асинхронный электродвигатель</w:t>
-            </w:r>
-          </w:p>
-        </w:tc>
-      </w:tr>
-      <w:tr>
-        <w:tc>
-          <w:tcPr>
-            <w:tcW w:w="4248" w:type="dxa"/>
-            <w:shd w:val="clear" w:color="auto" w:fill="F2F2F2" w:themeFill="background1" w:themeFillShade="F2"/>
-            <w:vAlign w:val="center"/>
-          </w:tcPr>
-          <w:p>
-            <w:pPr>
-              <w:rPr>
-                <w:rFonts w:ascii="Arial" w:hAnsi="Arial" w:cs="Arial"/>
-                <w:sz w:val="22"/>
-                <w:szCs w:val="18"/>
-              </w:rPr>
-            </w:pPr>
-            <w:r>
-              <w:rPr>
-                <w:rFonts w:ascii="Arial" w:hAnsi="Arial" w:cs="Arial"/>
-                <w:sz w:val="22"/>
-                <w:szCs w:val="18"/>
-              </w:rPr>
-              <w:t>Номинальная м</w:t>
-            </w:r>
-            <w:r>
-              <w:rPr>
-                <w:rFonts w:ascii="Arial" w:hAnsi="Arial" w:cs="Arial"/>
-                <w:sz w:val="22"/>
-                <w:szCs w:val="18"/>
-              </w:rPr>
-              <w:t>ощность электродвигателя</w:t>
-            </w:r>
-          </w:p>
-        </w:tc>
-        <w:tc>
-          <w:tcPr>
-            <w:tcW w:w="4812" w:type="dxa"/>
-            <w:shd w:val="clear" w:color="auto" w:fill="F2F2F2" w:themeFill="background1" w:themeFillShade="F2"/>
-            <w:vAlign w:val="center"/>
-          </w:tcPr>
-          <w:p>
-            <w:pPr>
-              <w:jc w:val="center"/>
-              <w:rPr>
-                <w:rFonts w:ascii="Arial" w:hAnsi="Arial" w:cs="Arial"/>
-                <w:b/>
-                <w:bCs/>
-                <w:sz w:val="22"/>
-                <w:szCs w:val="18"/>
-              </w:rPr>
-            </w:pPr>
-            <w:r>
-              <w:rPr>
-                <w:rFonts w:ascii="Arial" w:hAnsi="Arial" w:cs="Arial"/>
-                <w:b/>
-                <w:bCs/>
-                <w:sz w:val="22"/>
-                <w:szCs w:val="18"/>
-              </w:rPr>
-              <w:t>200 кВт</w:t>
-            </w:r>
-          </w:p>
-        </w:tc>
-      </w:tr>
-      <w:tr>
-        <w:tc>
-          <w:tcPr>
-            <w:tcW w:w="4248" w:type="dxa"/>
-            <w:vAlign w:val="center"/>
-          </w:tcPr>
-          <w:p>
-            <w:pPr>
-              <w:rPr>
-                <w:rFonts w:ascii="Arial" w:hAnsi="Arial" w:cs="Arial"/>
-                <w:sz w:val="22"/>
-                <w:szCs w:val="18"/>
-              </w:rPr>
-            </w:pPr>
-            <w:r>
-              <w:rPr>
-                <w:rFonts w:ascii="Arial" w:hAnsi="Arial" w:cs="Arial"/>
-                <w:sz w:val="22"/>
-                <w:szCs w:val="18"/>
-              </w:rPr>
-              <w:t>Номинальный ток</w:t>
-            </w:r>
-          </w:p>
-        </w:tc>
-        <w:tc>
-          <w:tcPr>
-            <w:tcW w:w="4812" w:type="dxa"/>
-            <w:vAlign w:val="center"/>
-          </w:tcPr>
-          <w:p>
-            <w:pPr>
-              <w:jc w:val="center"/>
-              <w:rPr>
-                <w:rFonts w:ascii="Arial" w:hAnsi="Arial" w:cs="Arial"/>
-                <w:b/>
-                <w:bCs/>
-                <w:sz w:val="22"/>
-                <w:szCs w:val="18"/>
-              </w:rPr>
-            </w:pPr>
-            <w:r>
-              <w:rPr>
-                <w:rFonts w:ascii="Arial" w:hAnsi="Arial" w:cs="Arial"/>
-                <w:b/>
-                <w:bCs/>
-                <w:sz w:val="22"/>
-                <w:szCs w:val="18"/>
-              </w:rPr>
-              <w:t>364 А (</w:t>
-            </w:r>
-            <w:r>
-              <w:rPr>
-                <w:rFonts w:ascii="Cambria Math" w:hAnsi="Cambria Math" w:cs="Cambria Math"/>
-                <w:b/>
-                <w:bCs/>
-                <w:sz w:val="22"/>
-                <w:szCs w:val="18"/>
-              </w:rPr>
-              <w:t>△</w:t>
-            </w:r>
-            <w:r>
-              <w:rPr>
-                <w:rFonts w:ascii="Arial" w:hAnsi="Arial" w:cs="Arial"/>
-                <w:b/>
-                <w:bCs/>
-                <w:sz w:val="22"/>
-                <w:szCs w:val="18"/>
-              </w:rPr>
-              <w:t xml:space="preserve"> подключение)</w:t>
-            </w:r>
-          </w:p>
-        </w:tc>
-      </w:tr>
-      <w:tr>
-        <w:tc>
-          <w:tcPr>
-            <w:tcW w:w="4248" w:type="dxa"/>
-            <w:shd w:val="clear" w:color="auto" w:fill="F2F2F2" w:themeFill="background1" w:themeFillShade="F2"/>
-            <w:vAlign w:val="center"/>
-          </w:tcPr>
-          <w:p>
-            <w:pPr>
-              <w:rPr>
-                <w:rFonts w:ascii="Arial" w:hAnsi="Arial" w:cs="Arial"/>
-                <w:sz w:val="22"/>
-                <w:szCs w:val="18"/>
-              </w:rPr>
-            </w:pPr>
-            <w:r>
-              <w:rPr>
-                <w:rFonts w:ascii="Arial" w:hAnsi="Arial" w:cs="Arial"/>
-                <w:sz w:val="22"/>
-                <w:szCs w:val="18"/>
-              </w:rPr>
-              <w:t>Номинальная скорость</w:t>
-            </w:r>
-          </w:p>
-        </w:tc>
-        <w:tc>
-          <w:tcPr>
-            <w:tcW w:w="4812" w:type="dxa"/>
-            <w:shd w:val="clear" w:color="auto" w:fill="F2F2F2" w:themeFill="background1" w:themeFillShade="F2"/>
-            <w:vAlign w:val="center"/>
-          </w:tcPr>
-          <w:p>
-            <w:pPr>
-              <w:jc w:val="center"/>
-              <w:rPr>
-                <w:rFonts w:ascii="Arial" w:hAnsi="Arial" w:cs="Arial"/>
-                <w:b/>
-                <w:bCs/>
-                <w:sz w:val="22"/>
-                <w:szCs w:val="18"/>
-              </w:rPr>
-            </w:pPr>
-            <w:r>
-              <w:rPr>
-                <w:rFonts w:ascii="Arial" w:hAnsi="Arial" w:cs="Arial"/>
-                <w:b/>
-                <w:bCs/>
-                <w:sz w:val="22"/>
-                <w:szCs w:val="18"/>
-              </w:rPr>
-              <w:t>1480 об/мин</w:t>
-            </w:r>
-          </w:p>
-        </w:tc>
-      </w:tr>
-      <w:tr>
-        <w:tc>
-          <w:tcPr>
-            <w:tcW w:w="4248" w:type="dxa"/>
-            <w:vAlign w:val="center"/>
-          </w:tcPr>
-          <w:p>
-            <w:pPr>
-              <w:rPr>
-                <w:rFonts w:ascii="Arial" w:hAnsi="Arial" w:cs="Arial"/>
-                <w:sz w:val="22"/>
-                <w:szCs w:val="18"/>
-              </w:rPr>
-            </w:pPr>
-            <w:r>
-              <w:rPr>
-                <w:rFonts w:ascii="Arial" w:hAnsi="Arial" w:cs="Arial"/>
-                <w:sz w:val="22"/>
-                <w:szCs w:val="18"/>
-              </w:rPr>
-              <w:t>КПД</w:t>
-            </w:r>
-          </w:p>
-        </w:tc>
-        <w:tc>
-          <w:tcPr>
-            <w:tcW w:w="4812" w:type="dxa"/>
-            <w:vAlign w:val="center"/>
-          </w:tcPr>
-          <w:p>
-            <w:pPr>
-              <w:jc w:val="center"/>
-              <w:rPr>
-                <w:rFonts w:ascii="Arial" w:hAnsi="Arial" w:cs="Arial"/>
-                <w:b/>
-                <w:bCs/>
-                <w:sz w:val="22"/>
-                <w:szCs w:val="18"/>
-              </w:rPr>
-            </w:pPr>
-            <w:r>
-              <w:rPr>
-                <w:rFonts w:ascii="Arial" w:hAnsi="Arial" w:cs="Arial"/>
-                <w:b/>
-                <w:bCs/>
-                <w:sz w:val="22"/>
-                <w:szCs w:val="18"/>
-              </w:rPr>
-              <w:t>96,0%</w:t>
-            </w:r>
-          </w:p>
-        </w:tc>
-      </w:tr>
-      <w:tr>
-        <w:tc>
-          <w:tcPr>
-            <w:tcW w:w="4248" w:type="dxa"/>
-            <w:shd w:val="clear" w:color="auto" w:fill="F2F2F2" w:themeFill="background1" w:themeFillShade="F2"/>
-            <w:vAlign w:val="center"/>
-          </w:tcPr>
-          <w:p>
-            <w:pPr>
-              <w:rPr>
-                <w:rFonts w:ascii="Arial" w:hAnsi="Arial" w:cs="Arial"/>
-                <w:sz w:val="22"/>
-                <w:szCs w:val="18"/>
-              </w:rPr>
-            </w:pPr>
-            <w:r>
-              <w:rPr>
-                <w:rFonts w:ascii="Arial" w:hAnsi="Arial" w:cs="Arial"/>
-                <w:sz w:val="22"/>
-                <w:szCs w:val="18"/>
-              </w:rPr>
-              <w:t>Коэффициент мощности</w:t>
-            </w:r>
-          </w:p>
-        </w:tc>
-        <w:tc>
-          <w:tcPr>
-            <w:tcW w:w="4812" w:type="dxa"/>
-            <w:shd w:val="clear" w:color="auto" w:fill="F2F2F2" w:themeFill="background1" w:themeFillShade="F2"/>
-            <w:vAlign w:val="center"/>
-          </w:tcPr>
-          <w:p>
-            <w:pPr>
-              <w:jc w:val="center"/>
-              <w:rPr>
-                <w:rFonts w:ascii="Arial" w:hAnsi="Arial" w:cs="Arial"/>
-                <w:b/>
-                <w:bCs/>
-                <w:sz w:val="22"/>
-                <w:szCs w:val="18"/>
-              </w:rPr>
-            </w:pPr>
-            <w:r>
-              <w:rPr>
-                <w:rFonts w:ascii="Arial" w:hAnsi="Arial" w:cs="Arial"/>
-                <w:b/>
-                <w:bCs/>
-                <w:sz w:val="22"/>
-                <w:szCs w:val="18"/>
-              </w:rPr>
-              <w:t>0,89</w:t>
-            </w:r>
-          </w:p>
-        </w:tc>
-      </w:tr>
-      <w:tr>
-        <w:tc>
-          <w:tcPr>
-            <w:tcW w:w="4248" w:type="dxa"/>
-            <w:vAlign w:val="center"/>
-          </w:tcPr>
-          <w:p>
-            <w:pPr>
-              <w:rPr>
-                <w:rFonts w:ascii="Arial" w:hAnsi="Arial" w:cs="Arial"/>
-                <w:sz w:val="22"/>
-                <w:szCs w:val="18"/>
-              </w:rPr>
-            </w:pPr>
-            <w:r>
-              <w:rPr>
-                <w:rFonts w:ascii="Arial" w:hAnsi="Arial" w:cs="Arial"/>
-                <w:sz w:val="22"/>
-                <w:szCs w:val="18"/>
-              </w:rPr>
-              <w:t>Момент блокировки</w:t>
-            </w:r>
-            <w:r>
-              <w:rPr>
-                <w:rFonts w:ascii="Arial" w:hAnsi="Arial" w:cs="Arial"/>
-                <w:sz w:val="22"/>
-                <w:szCs w:val="18"/>
-              </w:rPr>
-              <w:t xml:space="preserve"> </w:t>
-            </w:r>
-            <w:r>
-              <w:rPr>
-                <w:rFonts w:ascii="Arial" w:hAnsi="Arial" w:cs="Arial"/>
-                <w:sz w:val="22"/>
-                <w:szCs w:val="18"/>
-              </w:rPr>
-              <w:t>/</w:t>
-            </w:r>
-            <w:r>
-              <w:rPr>
-                <w:rFonts w:ascii="Arial" w:hAnsi="Arial" w:cs="Arial"/>
-                <w:sz w:val="22"/>
-                <w:szCs w:val="18"/>
-              </w:rPr>
-              <w:t xml:space="preserve"> </w:t>
-            </w:r>
-            <w:r>
-              <w:rPr>
-                <w:rFonts w:ascii="Arial" w:hAnsi="Arial" w:cs="Arial"/>
-                <w:sz w:val="22"/>
-                <w:szCs w:val="18"/>
-              </w:rPr>
-              <w:br/>
-            </w:r>
-            <w:r>
-              <w:rPr>
-                <w:rFonts w:ascii="Arial" w:hAnsi="Arial" w:cs="Arial"/>
-                <w:sz w:val="22"/>
-                <w:szCs w:val="18"/>
-              </w:rPr>
-              <w:t>номинальный крутящий момент</w:t>
-            </w:r>
-          </w:p>
-        </w:tc>
-        <w:tc>
-          <w:tcPr>
-            <w:tcW w:w="4812" w:type="dxa"/>
-            <w:vAlign w:val="center"/>
-          </w:tcPr>
-          <w:p>
-            <w:pPr>
-              <w:jc w:val="center"/>
-              <w:rPr>
-                <w:rFonts w:ascii="Arial" w:hAnsi="Arial" w:cs="Arial"/>
-                <w:b/>
-                <w:bCs/>
-                <w:sz w:val="22"/>
-                <w:szCs w:val="18"/>
-              </w:rPr>
-            </w:pPr>
-            <w:r>
-              <w:rPr>
-                <w:rFonts w:ascii="Arial" w:hAnsi="Arial" w:cs="Arial"/>
-                <w:b/>
-                <w:bCs/>
-                <w:sz w:val="22"/>
-                <w:szCs w:val="18"/>
-              </w:rPr>
-              <w:t>1,9</w:t>
-            </w:r>
-            <w:r>
-              <w:rPr>
-                <w:rFonts w:ascii="Arial" w:hAnsi="Arial" w:cs="Arial"/>
-                <w:b/>
-                <w:bCs/>
-                <w:sz w:val="22"/>
-                <w:szCs w:val="18"/>
-              </w:rPr>
-              <w:t xml:space="preserve"> </w:t>
-            </w:r>
-            <w:r>
-              <w:rPr>
-                <w:rFonts w:ascii="Arial" w:hAnsi="Arial" w:cs="Arial"/>
-                <w:b/>
-                <w:bCs/>
-                <w:sz w:val="22"/>
-                <w:szCs w:val="18"/>
-              </w:rPr>
-              <w:t>Н·м</w:t>
-            </w:r>
-          </w:p>
-        </w:tc>
-      </w:tr>
-      <w:tr>
-        <w:tc>
-          <w:tcPr>
-            <w:tcW w:w="4248" w:type="dxa"/>
-            <w:shd w:val="clear" w:color="auto" w:fill="F2F2F2" w:themeFill="background1" w:themeFillShade="F2"/>
-            <w:vAlign w:val="center"/>
-          </w:tcPr>
-          <w:p>
-            <w:pPr>
-              <w:rPr>
-                <w:rFonts w:ascii="Arial" w:hAnsi="Arial" w:cs="Arial"/>
-                <w:sz w:val="22"/>
-                <w:szCs w:val="18"/>
-              </w:rPr>
-            </w:pPr>
-            <w:r>
-              <w:rPr>
-                <w:rFonts w:ascii="Arial" w:hAnsi="Arial" w:cs="Arial"/>
-                <w:sz w:val="22"/>
-                <w:szCs w:val="18"/>
-              </w:rPr>
-              <w:t>Ток блокировки ротора</w:t>
-            </w:r>
-            <w:r>
-              <w:rPr>
-                <w:rFonts w:ascii="Arial" w:hAnsi="Arial" w:cs="Arial"/>
-                <w:sz w:val="22"/>
-                <w:szCs w:val="18"/>
-              </w:rPr>
-              <w:t xml:space="preserve"> </w:t>
-            </w:r>
-            <w:r>
-              <w:rPr>
-                <w:rFonts w:ascii="Arial" w:hAnsi="Arial" w:cs="Arial"/>
-                <w:sz w:val="22"/>
-                <w:szCs w:val="18"/>
-              </w:rPr>
-              <w:t>/</w:t>
-            </w:r>
-            <w:r>
-              <w:rPr>
-                <w:rFonts w:ascii="Arial" w:hAnsi="Arial" w:cs="Arial"/>
-                <w:sz w:val="22"/>
-                <w:szCs w:val="18"/>
-              </w:rPr>
-              <w:t xml:space="preserve"> </w:t>
-            </w:r>
-            <w:r>
-              <w:rPr>
-                <w:rFonts w:ascii="Arial" w:hAnsi="Arial" w:cs="Arial"/>
-                <w:sz w:val="22"/>
-                <w:szCs w:val="18"/>
-              </w:rPr>
-              <w:br/>
-            </w:r>
-            <w:r>
-              <w:rPr>
-                <w:rFonts w:ascii="Arial" w:hAnsi="Arial" w:cs="Arial"/>
-                <w:sz w:val="22"/>
-                <w:szCs w:val="18"/>
-              </w:rPr>
-              <w:t>номинальный ток</w:t>
-            </w:r>
-          </w:p>
-        </w:tc>
-        <w:tc>
-          <w:tcPr>
-            <w:tcW w:w="4812" w:type="dxa"/>
-            <w:shd w:val="clear" w:color="auto" w:fill="F2F2F2" w:themeFill="background1" w:themeFillShade="F2"/>
-            <w:vAlign w:val="center"/>
-          </w:tcPr>
-          <w:p>
-            <w:pPr>
-              <w:jc w:val="center"/>
-              <w:rPr>
-                <w:rFonts w:ascii="Arial" w:hAnsi="Arial" w:cs="Arial"/>
-                <w:b/>
-                <w:bCs/>
-                <w:sz w:val="22"/>
-                <w:szCs w:val="18"/>
-              </w:rPr>
-            </w:pPr>
-            <w:r>
-              <w:rPr>
-                <w:rFonts w:ascii="Arial" w:hAnsi="Arial" w:cs="Arial"/>
-                <w:b/>
-                <w:bCs/>
-                <w:sz w:val="22"/>
-                <w:szCs w:val="18"/>
-              </w:rPr>
-              <w:t>6,5</w:t>
-            </w:r>
-            <w:r>
-              <w:rPr>
-                <w:rFonts w:ascii="Arial" w:hAnsi="Arial" w:cs="Arial"/>
-                <w:b/>
-                <w:bCs/>
-                <w:sz w:val="22"/>
-                <w:szCs w:val="18"/>
-              </w:rPr>
-              <w:t xml:space="preserve"> </w:t>
-            </w:r>
-            <w:r>
-              <w:rPr>
-                <w:rFonts w:ascii="Arial" w:hAnsi="Arial" w:cs="Arial"/>
-                <w:b/>
-                <w:bCs/>
-                <w:sz w:val="22"/>
-                <w:szCs w:val="18"/>
-              </w:rPr>
-              <w:t>А</w:t>
-            </w:r>
-          </w:p>
-        </w:tc>
-      </w:tr>
-      <w:tr>
-        <w:tc>
-          <w:tcPr>
-            <w:tcW w:w="4248" w:type="dxa"/>
-            <w:vAlign w:val="center"/>
-          </w:tcPr>
-          <w:p>
-            <w:pPr>
-              <w:rPr>
-                <w:rFonts w:ascii="Arial" w:hAnsi="Arial" w:cs="Arial"/>
-                <w:sz w:val="22"/>
-                <w:szCs w:val="18"/>
-              </w:rPr>
-            </w:pPr>
-            <w:r>
-              <w:rPr>
-                <w:rFonts w:ascii="Arial" w:hAnsi="Arial" w:cs="Arial"/>
-                <w:sz w:val="22"/>
-                <w:szCs w:val="18"/>
-              </w:rPr>
-              <w:t>Максимальный крутящий момент</w:t>
-            </w:r>
-            <w:r>
-              <w:rPr>
-                <w:rFonts w:ascii="Arial" w:hAnsi="Arial" w:cs="Arial"/>
-                <w:sz w:val="22"/>
-                <w:szCs w:val="18"/>
-              </w:rPr>
-              <w:t xml:space="preserve"> </w:t>
-            </w:r>
-            <w:r>
-              <w:rPr>
-                <w:rFonts w:ascii="Arial" w:hAnsi="Arial" w:cs="Arial"/>
-                <w:sz w:val="22"/>
-                <w:szCs w:val="18"/>
-              </w:rPr>
-              <w:t>/</w:t>
-            </w:r>
-            <w:r>
-              <w:rPr>
-                <w:rFonts w:ascii="Arial" w:hAnsi="Arial" w:cs="Arial"/>
-                <w:sz w:val="22"/>
-                <w:szCs w:val="18"/>
-              </w:rPr>
-              <w:t xml:space="preserve"> </w:t>
-            </w:r>
-            <w:r>
-              <w:rPr>
-                <w:rFonts w:ascii="Arial" w:hAnsi="Arial" w:cs="Arial"/>
-                <w:sz w:val="22"/>
-                <w:szCs w:val="18"/>
-              </w:rPr>
-              <w:t>номинальный крутящий момент</w:t>
-            </w:r>
-          </w:p>
-        </w:tc>
-        <w:tc>
-          <w:tcPr>
-            <w:tcW w:w="4812" w:type="dxa"/>
-            <w:vAlign w:val="center"/>
-          </w:tcPr>
-          <w:p>
-            <w:pPr>
-              <w:jc w:val="center"/>
-              <w:rPr>
-                <w:rFonts w:ascii="Arial" w:hAnsi="Arial" w:cs="Arial"/>
-                <w:b/>
-                <w:bCs/>
-                <w:sz w:val="22"/>
-                <w:szCs w:val="18"/>
-              </w:rPr>
-            </w:pPr>
-            <w:r>
-              <w:rPr>
-                <w:rFonts w:ascii="Arial" w:hAnsi="Arial" w:cs="Arial"/>
-                <w:b/>
-                <w:bCs/>
-                <w:sz w:val="22"/>
-                <w:szCs w:val="18"/>
-              </w:rPr>
-              <w:t>2,2</w:t>
-            </w:r>
-            <w:r>
-              <w:rPr>
-                <w:rFonts w:ascii="Arial" w:hAnsi="Arial" w:cs="Arial"/>
-                <w:b/>
-                <w:bCs/>
-                <w:sz w:val="22"/>
-                <w:szCs w:val="18"/>
-              </w:rPr>
-              <w:t xml:space="preserve"> </w:t>
-            </w:r>
-            <w:r>
-              <w:rPr>
-                <w:rFonts w:ascii="Arial" w:hAnsi="Arial" w:cs="Arial"/>
-                <w:b/>
-                <w:bCs/>
-                <w:sz w:val="22"/>
-                <w:szCs w:val="18"/>
-              </w:rPr>
-              <w:t>Н·м</w:t>
-            </w:r>
-          </w:p>
-        </w:tc>
-      </w:tr>
-      <w:tr>
-        <w:tc>
-          <w:tcPr>
-            <w:tcW w:w="4248" w:type="dxa"/>
-            <w:shd w:val="clear" w:color="auto" w:fill="F2F2F2" w:themeFill="background1" w:themeFillShade="F2"/>
-            <w:vAlign w:val="center"/>
-          </w:tcPr>
-          <w:p>
-            <w:pPr>
-              <w:rPr>
-                <w:rFonts w:ascii="Arial" w:hAnsi="Arial" w:cs="Arial"/>
-                <w:sz w:val="22"/>
-                <w:szCs w:val="18"/>
-              </w:rPr>
-            </w:pPr>
-            <w:r>
-              <w:rPr>
-                <w:rFonts w:ascii="Arial" w:hAnsi="Arial" w:cs="Arial"/>
-                <w:sz w:val="22"/>
-                <w:szCs w:val="18"/>
-              </w:rPr>
-              <w:t>Питание</w:t>
-            </w:r>
-          </w:p>
-        </w:tc>
-        <w:tc>
-          <w:tcPr>
-            <w:tcW w:w="4812" w:type="dxa"/>
-            <w:shd w:val="clear" w:color="auto" w:fill="F2F2F2" w:themeFill="background1" w:themeFillShade="F2"/>
-            <w:vAlign w:val="center"/>
-          </w:tcPr>
-          <w:p>
-            <w:pPr>
-              <w:jc w:val="center"/>
-              <w:rPr>
-                <w:rFonts w:ascii="Arial" w:hAnsi="Arial" w:cs="Arial"/>
-                <w:b/>
-                <w:bCs/>
-                <w:sz w:val="22"/>
-                <w:szCs w:val="18"/>
-              </w:rPr>
-            </w:pPr>
-            <w:r>
-              <w:rPr>
-                <w:rFonts w:ascii="Arial" w:hAnsi="Arial" w:cs="Arial"/>
-                <w:b/>
-                <w:bCs/>
-                <w:sz w:val="22"/>
-                <w:szCs w:val="18"/>
-              </w:rPr>
-              <w:t>380 В, 50 Гц, 3-фазный</w:t>
-            </w:r>
-          </w:p>
-        </w:tc>
-      </w:tr>
-      <w:tr>
-        <w:tc>
-          <w:tcPr>
-            <w:tcW w:w="4248" w:type="dxa"/>
-            <w:vAlign w:val="center"/>
-          </w:tcPr>
-          <w:p>
-            <w:pPr>
-              <w:rPr>
-                <w:rFonts w:ascii="Arial" w:hAnsi="Arial" w:cs="Arial"/>
-                <w:sz w:val="22"/>
-                <w:szCs w:val="18"/>
-              </w:rPr>
-            </w:pPr>
-            <w:r>
-              <w:rPr>
-                <w:rFonts w:ascii="Arial" w:hAnsi="Arial" w:cs="Arial"/>
-                <w:sz w:val="22"/>
-                <w:szCs w:val="18"/>
-              </w:rPr>
-              <w:t>Частота вращения</w:t>
-            </w:r>
-          </w:p>
-        </w:tc>
-        <w:tc>
-          <w:tcPr>
-            <w:tcW w:w="4812" w:type="dxa"/>
-            <w:vAlign w:val="center"/>
-          </w:tcPr>
-          <w:p>
-            <w:pPr>
-              <w:jc w:val="center"/>
-              <w:rPr>
-                <w:rFonts w:ascii="Arial" w:hAnsi="Arial" w:cs="Arial"/>
-                <w:b/>
-                <w:bCs/>
-                <w:sz w:val="22"/>
-                <w:szCs w:val="18"/>
-              </w:rPr>
-            </w:pPr>
-            <w:r>
-              <w:rPr>
-                <w:rFonts w:ascii="Arial" w:hAnsi="Arial" w:cs="Arial"/>
-                <w:b/>
-                <w:bCs/>
-                <w:sz w:val="22"/>
-                <w:szCs w:val="18"/>
-              </w:rPr>
-              <w:t>300 об/мин</w:t>
-            </w:r>
-          </w:p>
-        </w:tc>
-      </w:tr>
-      <w:tr>
-        <w:tc>
-          <w:tcPr>
-            <w:tcW w:w="4248" w:type="dxa"/>
-            <w:shd w:val="clear" w:color="auto" w:fill="F2F2F2" w:themeFill="background1" w:themeFillShade="F2"/>
-            <w:vAlign w:val="center"/>
-          </w:tcPr>
-          <w:p>
-            <w:pPr>
-              <w:rPr>
-                <w:rFonts w:ascii="Arial" w:hAnsi="Arial" w:cs="Arial"/>
-                <w:sz w:val="22"/>
-                <w:szCs w:val="18"/>
-              </w:rPr>
-            </w:pPr>
-            <w:r>
-              <w:rPr>
-                <w:rFonts w:ascii="Arial" w:hAnsi="Arial" w:cs="Arial"/>
-                <w:sz w:val="22"/>
-                <w:szCs w:val="18"/>
-              </w:rPr>
-              <w:t>Производительность</w:t>
-            </w:r>
-          </w:p>
-        </w:tc>
-        <w:tc>
-          <w:tcPr>
-            <w:tcW w:w="4812" w:type="dxa"/>
-            <w:shd w:val="clear" w:color="auto" w:fill="F2F2F2" w:themeFill="background1" w:themeFillShade="F2"/>
-            <w:vAlign w:val="center"/>
-          </w:tcPr>
-          <w:p>
-            <w:pPr>
-              <w:jc w:val="center"/>
-              <w:rPr>
-                <w:rFonts w:ascii="Arial" w:hAnsi="Arial" w:cs="Arial"/>
-                <w:b/>
-                <w:bCs/>
-                <w:sz w:val="22"/>
-                <w:szCs w:val="18"/>
-              </w:rPr>
-            </w:pPr>
-            <w:r>
-              <w:rPr>
-                <w:rFonts w:ascii="Arial" w:hAnsi="Arial" w:cs="Arial"/>
-                <w:b/>
-                <w:bCs/>
-                <w:sz w:val="22"/>
-                <w:szCs w:val="18"/>
-              </w:rPr>
-              <w:t>168 м³/мин</w:t>
-            </w:r>
-          </w:p>
-        </w:tc>
-      </w:tr>
-      <w:tr>
-        <w:tc>
-          <w:tcPr>
-            <w:tcW w:w="4248" w:type="dxa"/>
-            <w:vAlign w:val="center"/>
-          </w:tcPr>
-          <w:p>
-            <w:pPr>
-              <w:rPr>
-                <w:rFonts w:ascii="Arial" w:hAnsi="Arial" w:cs="Arial"/>
-                <w:sz w:val="22"/>
-                <w:szCs w:val="18"/>
-              </w:rPr>
-            </w:pPr>
-            <w:r>
-              <w:rPr>
-                <w:rFonts w:ascii="Arial" w:hAnsi="Arial" w:cs="Arial"/>
-                <w:sz w:val="22"/>
-                <w:szCs w:val="18"/>
-              </w:rPr>
-              <w:t>Тип передачи</w:t>
-            </w:r>
-          </w:p>
-        </w:tc>
-        <w:tc>
-          <w:tcPr>
-            <w:tcW w:w="4812" w:type="dxa"/>
-            <w:vAlign w:val="center"/>
-          </w:tcPr>
-          <w:p>
-            <w:pPr>
-              <w:jc w:val="center"/>
-              <w:rPr>
-                <w:rFonts w:ascii="Arial" w:hAnsi="Arial" w:cs="Arial"/>
-                <w:b/>
-                <w:bCs/>
-                <w:sz w:val="22"/>
-                <w:szCs w:val="18"/>
-              </w:rPr>
-            </w:pPr>
-            <w:r>
-              <w:rPr>
-                <w:rFonts w:ascii="Arial" w:hAnsi="Arial" w:cs="Arial"/>
-                <w:b/>
-                <w:bCs/>
-                <w:sz w:val="22"/>
-                <w:szCs w:val="18"/>
-              </w:rPr>
-              <w:t xml:space="preserve">прямая муфтовая </w:t>
-            </w:r>
-            <w:r>
-              <w:rPr>
-                <w:rFonts w:ascii="Arial" w:hAnsi="Arial" w:cs="Arial"/>
-                <w:b/>
-                <w:bCs/>
-                <w:sz w:val="22"/>
-                <w:szCs w:val="18"/>
-              </w:rPr>
-              <w:br/>
-            </w:r>
-            <w:r>
-              <w:rPr>
-                <w:rFonts w:ascii="Arial" w:hAnsi="Arial" w:cs="Arial"/>
-                <w:b/>
-                <w:bCs/>
-                <w:sz w:val="22"/>
-                <w:szCs w:val="18"/>
-              </w:rPr>
-              <w:t>(непосредственное соединение)</w:t>
-            </w:r>
-          </w:p>
-        </w:tc>
-      </w:tr>
-      <w:tr>
-        <w:tc>
-          <w:tcPr>
-            <w:tcW w:w="4248" w:type="dxa"/>
-            <w:shd w:val="clear" w:color="auto" w:fill="F2F2F2" w:themeFill="background1" w:themeFillShade="F2"/>
-            <w:vAlign w:val="center"/>
-          </w:tcPr>
-          <w:p>
-            <w:pPr>
-              <w:rPr>
-                <w:rFonts w:ascii="Arial" w:hAnsi="Arial" w:cs="Arial"/>
-                <w:sz w:val="22"/>
-                <w:szCs w:val="18"/>
-              </w:rPr>
-            </w:pPr>
-            <w:r>
-              <w:rPr>
-                <w:rFonts w:ascii="Arial" w:hAnsi="Arial" w:cs="Arial"/>
-                <w:sz w:val="22"/>
-                <w:szCs w:val="18"/>
-              </w:rPr>
-              <w:t>Масса</w:t>
-            </w:r>
-          </w:p>
-        </w:tc>
-        <w:tc>
-          <w:tcPr>
-            <w:tcW w:w="4812" w:type="dxa"/>
-            <w:shd w:val="clear" w:color="auto" w:fill="F2F2F2" w:themeFill="background1" w:themeFillShade="F2"/>
-            <w:vAlign w:val="center"/>
-          </w:tcPr>
-          <w:p>
-            <w:pPr>
-              <w:jc w:val="center"/>
-              <w:rPr>
-                <w:rFonts w:ascii="Arial" w:hAnsi="Arial" w:cs="Arial"/>
-                <w:b/>
-                <w:bCs/>
-                <w:sz w:val="22"/>
-                <w:szCs w:val="18"/>
-              </w:rPr>
-            </w:pPr>
-            <w:r>
-              <w:rPr>
-                <w:rFonts w:ascii="Arial" w:hAnsi="Arial" w:cs="Arial"/>
-                <w:b/>
-                <w:bCs/>
-                <w:sz w:val="22"/>
-                <w:szCs w:val="18"/>
-              </w:rPr>
-              <w:t>5 500 кг</w:t>
-            </w:r>
-            <w:r>
-              <w:rPr>
-                <w:rFonts w:ascii="Arial" w:hAnsi="Arial" w:cs="Arial"/>
-                <w:b/>
-                <w:bCs/>
-                <w:sz w:val="22"/>
-                <w:szCs w:val="18"/>
-              </w:rPr>
-              <w:t>*</w:t>
-            </w:r>
-          </w:p>
-        </w:tc>
-      </w:tr>
-      <w:tr>
-        <w:tc>
-          <w:tcPr>
-            <w:tcW w:w="4248" w:type="dxa"/>
-            <w:vAlign w:val="center"/>
-          </w:tcPr>
-          <w:p>
-            <w:pPr>
-              <w:rPr>
-                <w:rFonts w:ascii="Arial" w:hAnsi="Arial" w:cs="Arial"/>
-                <w:sz w:val="22"/>
-                <w:szCs w:val="18"/>
-              </w:rPr>
-            </w:pPr>
-            <w:r>
-              <w:rPr>
-                <w:rFonts w:ascii="Arial" w:hAnsi="Arial" w:cs="Arial"/>
-                <w:sz w:val="22"/>
-                <w:szCs w:val="18"/>
-              </w:rPr>
-              <w:t>Объём</w:t>
-            </w:r>
-          </w:p>
-        </w:tc>
-        <w:tc>
-          <w:tcPr>
-            <w:tcW w:w="4812" w:type="dxa"/>
-            <w:vAlign w:val="center"/>
-          </w:tcPr>
-          <w:p>
-            <w:pPr>
-              <w:jc w:val="center"/>
-              <w:rPr>
-                <w:rFonts w:ascii="Arial" w:hAnsi="Arial" w:cs="Arial"/>
-                <w:b/>
-                <w:bCs/>
-                <w:sz w:val="22"/>
-                <w:szCs w:val="18"/>
-              </w:rPr>
-            </w:pPr>
-            <w:r>
-              <w:rPr>
-                <w:rFonts w:ascii="Arial" w:hAnsi="Arial" w:cs="Arial"/>
-                <w:b/>
-                <w:bCs/>
-                <w:sz w:val="22"/>
-                <w:szCs w:val="18"/>
-              </w:rPr>
-              <w:t>19,5 м³</w:t>
-            </w:r>
-          </w:p>
-        </w:tc>
-      </w:tr>
-      <w:tr>
-        <w:tc>
-          <w:tcPr>
-            <w:tcW w:w="4248" w:type="dxa"/>
-            <w:shd w:val="clear" w:color="auto" w:fill="F2F2F2" w:themeFill="background1" w:themeFillShade="F2"/>
-            <w:vAlign w:val="center"/>
-          </w:tcPr>
-          <w:p>
-            <w:pPr>
-              <w:rPr>
-                <w:rFonts w:ascii="Arial" w:hAnsi="Arial" w:cs="Arial"/>
-                <w:sz w:val="22"/>
-                <w:szCs w:val="18"/>
-              </w:rPr>
-            </w:pPr>
-            <w:r>
-              <w:rPr>
-                <w:rFonts w:ascii="Arial" w:hAnsi="Arial" w:cs="Arial"/>
-                <w:sz w:val="22"/>
-                <w:szCs w:val="18"/>
-              </w:rPr>
-              <w:t>Класс энергоэффективности</w:t>
-            </w:r>
-          </w:p>
-        </w:tc>
-        <w:tc>
-          <w:tcPr>
-            <w:tcW w:w="4812" w:type="dxa"/>
-            <w:shd w:val="clear" w:color="auto" w:fill="F2F2F2" w:themeFill="background1" w:themeFillShade="F2"/>
-            <w:vAlign w:val="center"/>
-          </w:tcPr>
-          <w:p>
-            <w:pPr>
-              <w:jc w:val="center"/>
-              <w:rPr>
-                <w:rFonts w:ascii="Arial" w:hAnsi="Arial" w:cs="Arial"/>
-                <w:b/>
-                <w:bCs/>
-                <w:sz w:val="22"/>
-                <w:szCs w:val="18"/>
-              </w:rPr>
-            </w:pPr>
-            <w:r>
-              <w:rPr>
-                <w:rFonts w:ascii="Arial" w:hAnsi="Arial" w:cs="Arial"/>
-                <w:b/>
-                <w:bCs/>
-                <w:sz w:val="22"/>
-                <w:szCs w:val="18"/>
-              </w:rPr>
-              <w:t>IE</w:t>
-            </w:r>
-            <w:r>
-              <w:rPr>
-                <w:rFonts w:ascii="Arial" w:hAnsi="Arial" w:cs="Arial"/>
-                <w:b/>
-                <w:bCs/>
-                <w:sz w:val="22"/>
-                <w:szCs w:val="18"/>
-              </w:rPr>
-              <w:t>2</w:t>
-            </w:r>
-          </w:p>
-        </w:tc>
-      </w:tr>
-      <w:tr>
-        <w:tc>
-          <w:tcPr>
-            <w:tcW w:w="4248" w:type="dxa"/>
-            <w:vAlign w:val="center"/>
-          </w:tcPr>
-          <w:p>
-            <w:pPr>
-              <w:rPr>
-                <w:rFonts w:ascii="Arial" w:hAnsi="Arial" w:cs="Arial"/>
-                <w:sz w:val="22"/>
-                <w:szCs w:val="18"/>
-              </w:rPr>
-            </w:pPr>
-            <w:r>
-              <w:rPr>
-                <w:rFonts w:ascii="Arial" w:hAnsi="Arial" w:cs="Arial"/>
-                <w:sz w:val="22"/>
-                <w:szCs w:val="18"/>
-              </w:rPr>
-              <w:t>Производство</w:t>
-            </w:r>
-          </w:p>
-        </w:tc>
-        <w:tc>
-          <w:tcPr>
-            <w:tcW w:w="4812" w:type="dxa"/>
-            <w:vAlign w:val="center"/>
-          </w:tcPr>
-          <w:p>
-            <w:pPr>
-              <w:jc w:val="center"/>
-              <w:rPr>
-                <w:rFonts w:ascii="Arial" w:hAnsi="Arial" w:cs="Arial"/>
-                <w:b/>
-                <w:bCs/>
-                <w:sz w:val="22"/>
-                <w:szCs w:val="18"/>
-              </w:rPr>
-            </w:pPr>
-            <w:r>
-              <w:rPr>
-                <w:rFonts w:ascii="Arial" w:hAnsi="Arial" w:cs="Arial"/>
-                <w:b/>
-                <w:bCs/>
-                <w:sz w:val="22"/>
-                <w:szCs w:val="18"/>
-              </w:rPr>
-              <w:t>Китай</w:t>
-            </w:r>
-          </w:p>
-        </w:tc>
-      </w:tr>
-    </w:tbl>
     <w:p>
       <w:pPr>
         <w:spacing w:before="120"/>
@@ -1856,16 +455,17 @@
           <w:szCs w:val="18"/>
         </w:rPr>
       </w:pPr>
-      <w:r>
-        <w:rPr>
-          <w:rFonts w:ascii="Arial" w:hAnsi="Arial" w:cs="Arial"/>
+    </w:p>
+    <w:p>
+      <w:pPr>
+        <w:spacing w:before="120"/>
+        <w:rPr>
           <w:i/>
           <w:iCs/>
-          <w:sz w:val="18"/>
-          <w:szCs w:val="14"/>
-        </w:rPr>
-        <w:t>* Указано примерное значение, точный вес станет известен только после завершения производства.</w:t>
-      </w:r>
+          <w:sz w:val="22"/>
+          <w:szCs w:val="18"/>
+        </w:rPr>
+      </w:pPr>
     </w:p>
     <w:p>
       <w:pPr>
@@ -2289,7 +889,23 @@
           <w:sz w:val="22"/>
         </w:rPr>
         <w:br/>
-        <w:t>директор ООО «Фарсал»,</w:t>
+        <w:t>директор ООО «</w:t>
+      </w:r>
+      <w:proofErr w:type="spellStart"/>
+      <w:r>
+        <w:rPr>
+          <w:rFonts w:ascii="Arial" w:hAnsi="Arial" w:cs="Arial"/>
+          <w:sz w:val="22"/>
+        </w:rPr>
+        <w:t>Фарсал</w:t>
+      </w:r>
+      <w:proofErr w:type="spellEnd"/>
+      <w:r>
+        <w:rPr>
+          <w:rFonts w:ascii="Arial" w:hAnsi="Arial" w:cs="Arial"/>
+          <w:sz w:val="22"/>
+        </w:rPr>
+        <w:t>»,</w:t>
       </w:r>
       <w:r>
         <w:rPr>
@@ -2309,12 +925,12 @@
       </w:r>
     </w:p>
     <w:sectPr>
-      <w:headerReference w:type="even" r:id="rId8"/>
-      <w:headerReference w:type="default" r:id="rId9"/>
-      <w:footerReference w:type="even" r:id="rId10"/>
-      <w:footerReference w:type="default" r:id="rId11"/>
-      <w:headerReference w:type="first" r:id="rId12"/>
-      <w:footerReference w:type="first" r:id="rId13"/>
+      <w:headerReference w:type="even" r:id="rId7"/>
+      <w:headerReference w:type="default" r:id="rId8"/>
+      <w:footerReference w:type="even" r:id="rId9"/>
+      <w:footerReference w:type="default" r:id="rId10"/>
+      <w:headerReference w:type="first" r:id="rId11"/>
+      <w:footerReference w:type="first" r:id="rId12"/>
       <w:pgSz w:w="11906" w:h="16838" w:code="9"/>
       <w:pgMar w:top="1701" w:right="1418" w:bottom="1134" w:left="1418" w:header="567" w:footer="709" w:gutter="0"/>
       <w:cols w:space="708"/>
@@ -3602,6 +2218,7 @@
   <w:style w:type="character" w:default="1" w:styleId="a0">
     <w:name w:val="Default Paragraph Font"/>
     <w:uiPriority w:val="1"/>
+    <w:semiHidden/>
     <w:unhideWhenUsed/>
   </w:style>
   <w:style w:type="table" w:default="1" w:styleId="a1">

</xml_diff>

<commit_message>
fix photo size, note position, remove warranty from conditions
</commit_message>
<xml_diff>
--- a/template/kp_template.docx
+++ b/template/kp_template.docx
@@ -272,25 +272,7 @@
           <w:b/>
           <w:bCs/>
         </w:rPr>
-        <w:t>ООО «</w:t>
-      </w:r>
-      <w:proofErr w:type="spellStart"/>
-      <w:r>
-        <w:rPr>
-          <w:rFonts w:ascii="Arial" w:hAnsi="Arial" w:cs="Arial"/>
-          <w:b/>
-          <w:bCs/>
-        </w:rPr>
-        <w:t>Фарсал</w:t>
-      </w:r>
-      <w:proofErr w:type="spellEnd"/>
-      <w:r>
-        <w:rPr>
-          <w:rFonts w:ascii="Arial" w:hAnsi="Arial" w:cs="Arial"/>
-          <w:b/>
-          <w:bCs/>
-        </w:rPr>
-        <w:t xml:space="preserve">» </w:t>
+        <w:t xml:space="preserve">ООО «Фарсал» </w:t>
       </w:r>
       <w:r>
         <w:rPr>
@@ -300,28 +282,6 @@
         </w:rPr>
         <w:t>предлагает к поставке</w:t>
       </w:r>
-    </w:p>
-    <w:p>
-      <w:pPr>
-        <w:spacing w:after="0"/>
-        <w:jc w:val="center"/>
-        <w:rPr>
-          <w:rFonts w:ascii="Arial" w:hAnsi="Arial" w:cs="Arial"/>
-          <w:sz w:val="24"/>
-          <w:szCs w:val="20"/>
-        </w:rPr>
-      </w:pPr>
-    </w:p>
-    <w:p>
-      <w:pPr>
-        <w:spacing w:after="0"/>
-        <w:jc w:val="both"/>
-        <w:rPr>
-          <w:rFonts w:ascii="Arial" w:hAnsi="Arial" w:cs="Arial"/>
-          <w:sz w:val="22"/>
-          <w:szCs w:val="18"/>
-        </w:rPr>
-      </w:pPr>
     </w:p>
     <w:p>
       <w:pPr>
@@ -388,23 +348,7 @@
           <w:sz w:val="22"/>
         </w:rPr>
         <w:br/>
-        <w:t>директор ООО «</w:t>
-      </w:r>
-      <w:proofErr w:type="spellStart"/>
-      <w:r>
-        <w:rPr>
-          <w:rFonts w:ascii="Arial" w:hAnsi="Arial" w:cs="Arial"/>
-          <w:sz w:val="22"/>
-        </w:rPr>
-        <w:t>Фарсал</w:t>
-      </w:r>
-      <w:proofErr w:type="spellEnd"/>
-      <w:r>
-        <w:rPr>
-          <w:rFonts w:ascii="Arial" w:hAnsi="Arial" w:cs="Arial"/>
-          <w:sz w:val="22"/>
-        </w:rPr>
-        <w:t>»,</w:t>
+        <w:t>директор ООО «Фарсал»,</w:t>
       </w:r>
       <w:r>
         <w:rPr>
@@ -1717,6 +1661,7 @@
   <w:style w:type="character" w:default="1" w:styleId="a0">
     <w:name w:val="Default Paragraph Font"/>
     <w:uiPriority w:val="1"/>
+    <w:semiHidden/>
     <w:unhideWhenUsed/>
   </w:style>
   <w:style w:type="table" w:default="1" w:styleId="a1">

</xml_diff>